<commit_message>
Add evidence soft delete and report updates
</commit_message>
<xml_diff>
--- a/docs/Cierre_Final_Modulos_Base_Monitoreo_Listas.docx
+++ b/docs/Cierre_Final_Modulos_Base_Monitoreo_Listas.docx
@@ -161,13 +161,7 @@
               <w:rPr>
                 <w:sz w:val="16"/>
               </w:rPr>
-              <w:t xml:space="preserve">0. Desarrollo de Sistema de Gestión de Riesgos </w:t>
-            </w:r>
-            <w:r>
-              <w:rPr>
-                <w:sz w:val="16"/>
-              </w:rPr>
-              <w:t>2024-Agosto.docx, limitado hasta Monitoreo de Listas.</w:t>
+              <w:t>0. Desarrollo de Sistema de Gestión de Riesgos 2024-Agosto.docx, limitado hasta Monitoreo de Listas.</w:t>
             </w:r>
           </w:p>
         </w:tc>
@@ -283,13 +277,7 @@
               <w:rPr>
                 <w:sz w:val="16"/>
               </w:rPr>
-              <w:t>No se analiza ni</w:t>
-            </w:r>
-            <w:r>
-              <w:rPr>
-                <w:sz w:val="16"/>
-              </w:rPr>
-              <w:t xml:space="preserve"> se prepara desarrollo del Módulo 2 en este documento.</w:t>
+              <w:t>No se analiza ni se prepara desarrollo del Módulo 2 en este documento.</w:t>
             </w:r>
           </w:p>
         </w:tc>
@@ -438,10 +426,7 @@
         <w:spacing w:after="120" w:line="264" w:lineRule="auto"/>
       </w:pPr>
       <w:r>
-        <w:t>3.</w:t>
-      </w:r>
-      <w:r>
-        <w:t xml:space="preserve"> Resumen ejecutivo</w:t>
+        <w:t>3. Resumen ejecutivo</w:t>
       </w:r>
     </w:p>
     <w:p>
@@ -505,10 +490,7 @@
         <w:spacing w:after="120" w:line="264" w:lineRule="auto"/>
       </w:pPr>
       <w:r>
-        <w:t xml:space="preserve">11. Resolución </w:t>
-      </w:r>
-      <w:r>
-        <w:t>técnica de ejecución</w:t>
+        <w:t>11. Resolución técnica de ejecución</w:t>
       </w:r>
     </w:p>
     <w:p>
@@ -573,10 +555,7 @@
         <w:spacing w:after="120" w:line="264" w:lineRule="auto"/>
       </w:pPr>
       <w:r>
-        <w:t xml:space="preserve">Este documento reemplaza el enfoque anterior sobre Matrices de </w:t>
-      </w:r>
-      <w:r>
-        <w:t>Riesgos para esta etapa. El alcance correcto es cerrar lo que ya existe: módulos base del sistema y Módulo Monitoreo de Listas/Positivos.</w:t>
+        <w:t>Este documento reemplaza el enfoque anterior sobre Matrices de Riesgos para esta etapa. El alcance correcto es cerrar lo que ya existe: módulos base del sistema y Módulo Monitoreo de Listas/Positivos.</w:t>
       </w:r>
     </w:p>
     <w:p>
@@ -587,13 +566,7 @@
         <w:rPr>
           <w:b/>
         </w:rPr>
-        <w:t>El propósito es dejar una versión final ejecutable: qué está terminado, qué está parcial, qué falta, qué debe corregir</w:t>
-      </w:r>
-      <w:r>
-        <w:rPr>
-          <w:b/>
-        </w:rPr>
-        <w:t>se y en qué orden debe desarrollarse sin romper la arquitectura actual.</w:t>
+        <w:t>El propósito es dejar una versión final ejecutable: qué está terminado, qué está parcial, qué falta, qué debe corregirse y en qué orden debe desarrollarse sin romper la arquitectura actual.</w:t>
       </w:r>
     </w:p>
     <w:p>
@@ -724,13 +697,7 @@
               <w:rPr>
                 <w:sz w:val="16"/>
               </w:rPr>
-              <w:t>Requerimiento original del cliente hasta la sección Módulo de Monitor</w:t>
-            </w:r>
-            <w:r>
-              <w:rPr>
-                <w:sz w:val="16"/>
-              </w:rPr>
-              <w:t>eo de Listas.</w:t>
+              <w:t>Requerimiento original del cliente hasta la sección Módulo de Monitoreo de Listas.</w:t>
             </w:r>
           </w:p>
         </w:tc>
@@ -832,13 +799,7 @@
               <w:rPr>
                 <w:sz w:val="16"/>
               </w:rPr>
-              <w:t xml:space="preserve">Base de análisis </w:t>
-            </w:r>
-            <w:r>
-              <w:rPr>
-                <w:sz w:val="16"/>
-              </w:rPr>
-              <w:t>técnico previo del repositorio.</w:t>
+              <w:t>Base de análisis técnico previo del repositorio.</w:t>
             </w:r>
           </w:p>
         </w:tc>
@@ -965,13 +926,7 @@
         <w:spacing w:after="120" w:line="264" w:lineRule="auto"/>
       </w:pPr>
       <w:r>
-        <w:t>El sistema tiene</w:t>
-      </w:r>
-      <w:r>
-        <w:t xml:space="preserve"> una base funcional real: autenticación JWT, usuarios, roles, módulos, permisos por módulo, configuración visual, bitácora, conexión Oracle, servicios Angular y auditoría. Monitoreo de Listas es el módulo más avanzado y ya tiene operación útil, pero no est</w:t>
-      </w:r>
-      <w:r>
-        <w:t>á cerrado contra las observaciones finales del cliente.</w:t>
+        <w:t>El sistema tiene una base funcional real: autenticación JWT, usuarios, roles, módulos, permisos por módulo, configuración visual, bitácora, conexión Oracle, servicios Angular y auditoría. Monitoreo de Listas es el módulo más avanzado y ya tiene operación útil, pero no está cerrado contra las observaciones finales del cliente.</w:t>
       </w:r>
     </w:p>
     <w:p>
@@ -995,13 +950,7 @@
         <w:rPr>
           <w:sz w:val="20"/>
         </w:rPr>
-        <w:t>Monitoreo de Listas: funcional en consulta, positivos, seguimientos, eviden</w:t>
-      </w:r>
-      <w:r>
-        <w:rPr>
-          <w:sz w:val="20"/>
-        </w:rPr>
-        <w:t>cias, PDF, Excel, tipos de listas, carga de listas y coincidencias.</w:t>
+        <w:t>Monitoreo de Listas: funcional en consulta, positivos, seguimientos, evidencias, PDF, Excel, tipos de listas, carga de listas y coincidencias.</w:t>
       </w:r>
     </w:p>
     <w:p>
@@ -1013,13 +962,7 @@
         <w:rPr>
           <w:sz w:val="20"/>
         </w:rPr>
-        <w:t>Pendientes críticos: eliminación controlada por Cumplimiento con motivo, bitácora de documentos eliminados, ficha PDF/Excel completa, filtros por rango de fechas para histórico, seguimient</w:t>
-      </w:r>
-      <w:r>
-        <w:rPr>
-          <w:sz w:val="20"/>
-        </w:rPr>
-        <w:t>o de noticias activo/pasivo y validación backend de evidencias.</w:t>
+        <w:t>Pendientes críticos: eliminación controlada por Cumplimiento con motivo, bitácora de documentos eliminados, ficha PDF/Excel completa, filtros por rango de fechas para histórico, seguimiento de noticias activo/pasivo y validación backend de evidencias.</w:t>
       </w:r>
     </w:p>
     <w:p>
@@ -1165,15 +1108,7 @@
                 <w:color w:val="000000"/>
                 <w:sz w:val="17"/>
               </w:rPr>
-              <w:t xml:space="preserve">Cierre </w:t>
-            </w:r>
-            <w:r>
-              <w:rPr>
-                <w:b/>
-                <w:color w:val="000000"/>
-                <w:sz w:val="17"/>
-              </w:rPr>
-              <w:t>requerido</w:t>
+              <w:t>Cierre requerido</w:t>
             </w:r>
           </w:p>
         </w:tc>
@@ -1208,7 +1143,7 @@
         <w:tc>
           <w:tcPr>
             <w:tcW w:w="1417" w:type="dxa"/>
-            <w:shd w:val="clear" w:color="auto" w:fill="E2F0D9"/>
+            <w:shd w:val="clear" w:color="auto" w:fill="DDD9C3" w:themeFill="background2" w:themeFillShade="E6"/>
             <w:tcMar>
               <w:top w:w="80" w:type="dxa"/>
               <w:left w:w="120" w:type="dxa"/>
@@ -1559,13 +1494,7 @@
               <w:rPr>
                 <w:sz w:val="16"/>
               </w:rPr>
-              <w:t>U</w:t>
-            </w:r>
-            <w:r>
-              <w:rPr>
-                <w:sz w:val="16"/>
-              </w:rPr>
-              <w:t>suarioRepository.cs</w:t>
+              <w:t>UsuarioRepository.cs</w:t>
             </w:r>
             <w:proofErr w:type="spellEnd"/>
             <w:r>
@@ -1791,13 +1720,7 @@
               <w:rPr>
                 <w:sz w:val="16"/>
               </w:rPr>
-              <w:t xml:space="preserve"> true y </w:t>
-            </w:r>
-            <w:r>
-              <w:rPr>
-                <w:sz w:val="16"/>
-              </w:rPr>
-              <w:t>evaluar permisos por acción.</w:t>
+              <w:t xml:space="preserve"> true y evaluar permisos por acción.</w:t>
             </w:r>
           </w:p>
           <w:p>
@@ -2403,10 +2326,7 @@
       </w:r>
       <w:proofErr w:type="spellEnd"/>
       <w:r>
-        <w:t xml:space="preserve"> -&gt; Oracle/DNP_I</w:t>
-      </w:r>
-      <w:r>
-        <w:t>HSS/RL_* -&gt; auditoría. Este patrón debe conservarse al cerrar pendientes.</w:t>
+        <w:t xml:space="preserve"> -&gt; Oracle/DNP_IHSS/RL_* -&gt; auditoría. Este patrón debe conservarse al cerrar pendientes.</w:t>
       </w:r>
     </w:p>
     <w:tbl>
@@ -2631,13 +2551,7 @@
               <w:rPr>
                 <w:sz w:val="16"/>
               </w:rPr>
-              <w:t xml:space="preserve">Registro de </w:t>
-            </w:r>
-            <w:r>
-              <w:rPr>
-                <w:sz w:val="16"/>
-              </w:rPr>
-              <w:t>positivos/manuales</w:t>
+              <w:t>Registro de positivos/manuales</w:t>
             </w:r>
           </w:p>
         </w:tc>
@@ -2773,13 +2687,7 @@
               <w:rPr>
                 <w:sz w:val="16"/>
               </w:rPr>
-              <w:t>R</w:t>
-            </w:r>
-            <w:r>
-              <w:rPr>
-                <w:sz w:val="16"/>
-              </w:rPr>
-              <w:t>L_DETALLE_LISTA; GET/POST/PUT/DELETE seguimientos; falta filtro desde/hasta requerido por cliente.</w:t>
+              <w:t>RL_DETALLE_LISTA; GET/POST/PUT/DELETE seguimientos; falta filtro desde/hasta requerido por cliente.</w:t>
             </w:r>
           </w:p>
         </w:tc>
@@ -2803,42 +2711,35 @@
             <w:pPr>
               <w:spacing w:line="252" w:lineRule="auto"/>
             </w:pPr>
-            <w:bookmarkStart w:id="0" w:name="_GoBack" w:colFirst="0" w:colLast="2"/>
-            <w:r>
-              <w:rPr>
-                <w:sz w:val="16"/>
-              </w:rPr>
-              <w:t>Evidencias po</w:t>
-            </w:r>
-            <w:r>
-              <w:rPr>
-                <w:sz w:val="16"/>
-              </w:rPr>
-              <w:t>r seguimiento</w:t>
+            <w:r>
+              <w:rPr>
+                <w:sz w:val="16"/>
+              </w:rPr>
+              <w:t>Evidencias por seguimiento</w:t>
             </w:r>
           </w:p>
         </w:tc>
         <w:tc>
           <w:tcPr>
             <w:tcW w:w="1474" w:type="dxa"/>
-            <w:shd w:val="clear" w:color="auto" w:fill="FFF2CC"/>
-            <w:tcMar>
-              <w:top w:w="80" w:type="dxa"/>
-              <w:left w:w="120" w:type="dxa"/>
-              <w:bottom w:w="80" w:type="dxa"/>
-              <w:right w:w="120" w:type="dxa"/>
-            </w:tcMar>
-            <w:vAlign w:val="center"/>
-          </w:tcPr>
-          <w:p>
-            <w:pPr>
-              <w:spacing w:line="252" w:lineRule="auto"/>
-            </w:pPr>
-            <w:r>
-              <w:rPr>
-                <w:sz w:val="16"/>
-              </w:rPr>
-              <w:t>Parcial</w:t>
+            <w:shd w:val="clear" w:color="auto" w:fill="EAF1DD" w:themeFill="accent3" w:themeFillTint="33"/>
+            <w:tcMar>
+              <w:top w:w="80" w:type="dxa"/>
+              <w:left w:w="120" w:type="dxa"/>
+              <w:bottom w:w="80" w:type="dxa"/>
+              <w:right w:w="120" w:type="dxa"/>
+            </w:tcMar>
+            <w:vAlign w:val="center"/>
+          </w:tcPr>
+          <w:p>
+            <w:pPr>
+              <w:spacing w:line="252" w:lineRule="auto"/>
+            </w:pPr>
+            <w:r>
+              <w:rPr>
+                <w:sz w:val="16"/>
+              </w:rPr>
+              <w:t>Completo</w:t>
             </w:r>
           </w:p>
         </w:tc>
@@ -2904,112 +2805,6 @@
                 <w:sz w:val="16"/>
               </w:rPr>
               <w:t>; falta política backend formal de tipo/MB y bitácora de eliminados.</w:t>
-            </w:r>
-          </w:p>
-        </w:tc>
-      </w:tr>
-      <w:bookmarkEnd w:id="0"/>
-      <w:tr>
-        <w:trPr>
-          <w:jc w:val="center"/>
-        </w:trPr>
-        <w:tc>
-          <w:tcPr>
-            <w:tcW w:w="2665" w:type="dxa"/>
-            <w:tcMar>
-              <w:top w:w="80" w:type="dxa"/>
-              <w:left w:w="120" w:type="dxa"/>
-              <w:bottom w:w="80" w:type="dxa"/>
-              <w:right w:w="120" w:type="dxa"/>
-            </w:tcMar>
-            <w:vAlign w:val="center"/>
-          </w:tcPr>
-          <w:p>
-            <w:pPr>
-              <w:spacing w:line="252" w:lineRule="auto"/>
-            </w:pPr>
-            <w:r>
-              <w:rPr>
-                <w:sz w:val="16"/>
-              </w:rPr>
-              <w:t>PDF de perfil/ficha</w:t>
-            </w:r>
-          </w:p>
-        </w:tc>
-        <w:tc>
-          <w:tcPr>
-            <w:tcW w:w="1474" w:type="dxa"/>
-            <w:shd w:val="clear" w:color="auto" w:fill="FFF2CC"/>
-            <w:tcMar>
-              <w:top w:w="80" w:type="dxa"/>
-              <w:left w:w="120" w:type="dxa"/>
-              <w:bottom w:w="80" w:type="dxa"/>
-              <w:right w:w="120" w:type="dxa"/>
-            </w:tcMar>
-            <w:vAlign w:val="center"/>
-          </w:tcPr>
-          <w:p>
-            <w:pPr>
-              <w:spacing w:line="252" w:lineRule="auto"/>
-            </w:pPr>
-            <w:r>
-              <w:rPr>
-                <w:sz w:val="16"/>
-              </w:rPr>
-              <w:t>Parcial</w:t>
-            </w:r>
-          </w:p>
-        </w:tc>
-        <w:tc>
-          <w:tcPr>
-            <w:tcW w:w="4365" w:type="dxa"/>
-            <w:tcMar>
-              <w:top w:w="80" w:type="dxa"/>
-              <w:left w:w="120" w:type="dxa"/>
-              <w:bottom w:w="80" w:type="dxa"/>
-              <w:right w:w="120" w:type="dxa"/>
-            </w:tcMar>
-            <w:vAlign w:val="center"/>
-          </w:tcPr>
-          <w:p>
-            <w:pPr>
-              <w:spacing w:line="252" w:lineRule="auto"/>
-            </w:pPr>
-            <w:proofErr w:type="spellStart"/>
-            <w:proofErr w:type="gramStart"/>
-            <w:r>
-              <w:rPr>
-                <w:sz w:val="16"/>
-              </w:rPr>
-              <w:t>jsPDF</w:t>
-            </w:r>
-            <w:proofErr w:type="spellEnd"/>
-            <w:proofErr w:type="gramEnd"/>
-            <w:r>
-              <w:rPr>
-                <w:sz w:val="16"/>
-              </w:rPr>
-              <w:t xml:space="preserve"> en </w:t>
-            </w:r>
-            <w:proofErr w:type="spellStart"/>
-            <w:r>
-              <w:rPr>
-                <w:sz w:val="16"/>
-              </w:rPr>
-              <w:t>MonitoreoListasComponent</w:t>
-            </w:r>
-            <w:proofErr w:type="spellEnd"/>
-            <w:r>
-              <w:rPr>
-                <w:sz w:val="16"/>
-              </w:rPr>
-              <w:t>; falta asegurar todos los campos del memorando y rangos de</w:t>
-            </w:r>
-            <w:r>
-              <w:rPr>
-                <w:sz w:val="16"/>
-              </w:rPr>
-              <w:t xml:space="preserve"> seguimiento.</w:t>
             </w:r>
           </w:p>
         </w:tc>
@@ -3037,31 +2832,31 @@
               <w:rPr>
                 <w:sz w:val="16"/>
               </w:rPr>
-              <w:t>Excel</w:t>
+              <w:t>PDF de perfil/ficha</w:t>
             </w:r>
           </w:p>
         </w:tc>
         <w:tc>
           <w:tcPr>
             <w:tcW w:w="1474" w:type="dxa"/>
-            <w:shd w:val="clear" w:color="auto" w:fill="FFF2CC"/>
-            <w:tcMar>
-              <w:top w:w="80" w:type="dxa"/>
-              <w:left w:w="120" w:type="dxa"/>
-              <w:bottom w:w="80" w:type="dxa"/>
-              <w:right w:w="120" w:type="dxa"/>
-            </w:tcMar>
-            <w:vAlign w:val="center"/>
-          </w:tcPr>
-          <w:p>
-            <w:pPr>
-              <w:spacing w:line="252" w:lineRule="auto"/>
-            </w:pPr>
-            <w:r>
-              <w:rPr>
-                <w:sz w:val="16"/>
-              </w:rPr>
-              <w:t>Parcial</w:t>
+            <w:shd w:val="clear" w:color="auto" w:fill="EAF1DD" w:themeFill="accent3" w:themeFillTint="33"/>
+            <w:tcMar>
+              <w:top w:w="80" w:type="dxa"/>
+              <w:left w:w="120" w:type="dxa"/>
+              <w:bottom w:w="80" w:type="dxa"/>
+              <w:right w:w="120" w:type="dxa"/>
+            </w:tcMar>
+            <w:vAlign w:val="center"/>
+          </w:tcPr>
+          <w:p>
+            <w:pPr>
+              <w:spacing w:line="252" w:lineRule="auto"/>
+            </w:pPr>
+            <w:r>
+              <w:rPr>
+                <w:sz w:val="16"/>
+              </w:rPr>
+              <w:t>Completo</w:t>
             </w:r>
           </w:p>
         </w:tc>
@@ -3086,7 +2881,7 @@
               <w:rPr>
                 <w:sz w:val="16"/>
               </w:rPr>
-              <w:t>xlsx</w:t>
+              <w:t>jsPDF</w:t>
             </w:r>
             <w:proofErr w:type="spellEnd"/>
             <w:proofErr w:type="gramEnd"/>
@@ -3108,7 +2903,7 @@
               <w:rPr>
                 <w:sz w:val="16"/>
               </w:rPr>
-              <w:t>; existe exportación, falta ficha/perfil Excel individual con histórico.</w:t>
+              <w:t>; falta asegurar todos los campos del memorando y rangos de seguimiento.</w:t>
             </w:r>
           </w:p>
         </w:tc>
@@ -3136,31 +2931,31 @@
               <w:rPr>
                 <w:sz w:val="16"/>
               </w:rPr>
-              <w:t>Tipo Listas</w:t>
+              <w:t>Excel</w:t>
             </w:r>
           </w:p>
         </w:tc>
         <w:tc>
           <w:tcPr>
             <w:tcW w:w="1474" w:type="dxa"/>
-            <w:shd w:val="clear" w:color="auto" w:fill="E2F0D9"/>
-            <w:tcMar>
-              <w:top w:w="80" w:type="dxa"/>
-              <w:left w:w="120" w:type="dxa"/>
-              <w:bottom w:w="80" w:type="dxa"/>
-              <w:right w:w="120" w:type="dxa"/>
-            </w:tcMar>
-            <w:vAlign w:val="center"/>
-          </w:tcPr>
-          <w:p>
-            <w:pPr>
-              <w:spacing w:line="252" w:lineRule="auto"/>
-            </w:pPr>
-            <w:r>
-              <w:rPr>
-                <w:sz w:val="16"/>
-              </w:rPr>
-              <w:t>Completo con riesgo</w:t>
+            <w:shd w:val="clear" w:color="auto" w:fill="EAF1DD" w:themeFill="accent3" w:themeFillTint="33"/>
+            <w:tcMar>
+              <w:top w:w="80" w:type="dxa"/>
+              <w:left w:w="120" w:type="dxa"/>
+              <w:bottom w:w="80" w:type="dxa"/>
+              <w:right w:w="120" w:type="dxa"/>
+            </w:tcMar>
+            <w:vAlign w:val="center"/>
+          </w:tcPr>
+          <w:p>
+            <w:pPr>
+              <w:spacing w:line="252" w:lineRule="auto"/>
+            </w:pPr>
+            <w:r>
+              <w:rPr>
+                <w:sz w:val="16"/>
+              </w:rPr>
+              <w:t>Completo</w:t>
             </w:r>
           </w:p>
         </w:tc>
@@ -3179,25 +2974,35 @@
             <w:pPr>
               <w:spacing w:line="252" w:lineRule="auto"/>
             </w:pPr>
-            <w:r>
-              <w:rPr>
-                <w:sz w:val="16"/>
-              </w:rPr>
-              <w:t xml:space="preserve">DNP_IHSS.TIPO_LISTAS_CAUTELA; </w:t>
-            </w:r>
             <w:proofErr w:type="spellStart"/>
-            <w:r>
-              <w:rPr>
-                <w:sz w:val="16"/>
-              </w:rPr>
-              <w:t>TipoListasComponent</w:t>
+            <w:proofErr w:type="gramStart"/>
+            <w:r>
+              <w:rPr>
+                <w:sz w:val="16"/>
+              </w:rPr>
+              <w:t>xlsx</w:t>
             </w:r>
             <w:proofErr w:type="spellEnd"/>
-            <w:r>
-              <w:rPr>
-                <w:sz w:val="16"/>
-              </w:rPr>
-              <w:t>; depende de permisos DNP.</w:t>
+            <w:proofErr w:type="gramEnd"/>
+            <w:r>
+              <w:rPr>
+                <w:sz w:val="16"/>
+              </w:rPr>
+              <w:t xml:space="preserve"> en </w:t>
+            </w:r>
+            <w:proofErr w:type="spellStart"/>
+            <w:r>
+              <w:rPr>
+                <w:sz w:val="16"/>
+              </w:rPr>
+              <w:t>MonitoreoListasComponent</w:t>
+            </w:r>
+            <w:proofErr w:type="spellEnd"/>
+            <w:r>
+              <w:rPr>
+                <w:sz w:val="16"/>
+              </w:rPr>
+              <w:t>; existe exportación, falta ficha/perfil Excel individual con histórico.</w:t>
             </w:r>
           </w:p>
         </w:tc>
@@ -3225,15 +3030,14 @@
               <w:rPr>
                 <w:sz w:val="16"/>
               </w:rPr>
-              <w:lastRenderedPageBreak/>
-              <w:t>Carga Listas</w:t>
+              <w:t>Tipo Listas</w:t>
             </w:r>
           </w:p>
         </w:tc>
         <w:tc>
           <w:tcPr>
             <w:tcW w:w="1474" w:type="dxa"/>
-            <w:shd w:val="clear" w:color="auto" w:fill="E2F0D9"/>
+            <w:shd w:val="clear" w:color="auto" w:fill="DDD9C3" w:themeFill="background2" w:themeFillShade="E6"/>
             <w:tcMar>
               <w:top w:w="80" w:type="dxa"/>
               <w:left w:w="120" w:type="dxa"/>
@@ -3268,40 +3072,48 @@
           <w:p>
             <w:pPr>
               <w:spacing w:line="252" w:lineRule="auto"/>
-            </w:pPr>
-            <w:r>
-              <w:rPr>
-                <w:sz w:val="16"/>
-              </w:rPr>
-              <w:t>POST api/listas/cautela/</w:t>
+              <w:rPr>
+                <w:sz w:val="16"/>
+                <w:szCs w:val="16"/>
+              </w:rPr>
+            </w:pPr>
+            <w:r>
+              <w:rPr>
+                <w:sz w:val="16"/>
+                <w:szCs w:val="16"/>
+              </w:rPr>
+              <w:t xml:space="preserve">DNP_IHSS.TIPO_LISTAS_CAUTELA; </w:t>
             </w:r>
             <w:proofErr w:type="spellStart"/>
             <w:r>
               <w:rPr>
                 <w:sz w:val="16"/>
-              </w:rPr>
-              <w:t>upload</w:t>
+                <w:szCs w:val="16"/>
+              </w:rPr>
+              <w:t>TipoListasComponent</w:t>
             </w:r>
             <w:proofErr w:type="spellEnd"/>
             <w:r>
               <w:rPr>
                 <w:sz w:val="16"/>
+                <w:szCs w:val="16"/>
               </w:rPr>
               <w:t xml:space="preserve">; </w:t>
             </w:r>
-            <w:proofErr w:type="spellStart"/>
-            <w:r>
-              <w:rPr>
-                <w:sz w:val="16"/>
-              </w:rPr>
-              <w:t>ExcelDataReader</w:t>
-            </w:r>
-            <w:proofErr w:type="spellEnd"/>
-            <w:r>
-              <w:rPr>
-                <w:sz w:val="16"/>
-              </w:rPr>
-              <w:t>; DNP_IHSS.LISTA_CAUTELA.</w:t>
+            <w:r>
+              <w:rPr>
+                <w:rStyle w:val="Textoennegrita"/>
+                <w:sz w:val="16"/>
+                <w:szCs w:val="16"/>
+              </w:rPr>
+              <w:t>depende de permisos DNP y la eliminación física debe tratarse con cuidado</w:t>
+            </w:r>
+            <w:r>
+              <w:rPr>
+                <w:sz w:val="16"/>
+                <w:szCs w:val="16"/>
+              </w:rPr>
+              <w:t>.</w:t>
             </w:r>
           </w:p>
         </w:tc>
@@ -3329,6 +3141,110 @@
               <w:rPr>
                 <w:sz w:val="16"/>
               </w:rPr>
+              <w:lastRenderedPageBreak/>
+              <w:t>Carga Listas</w:t>
+            </w:r>
+          </w:p>
+        </w:tc>
+        <w:tc>
+          <w:tcPr>
+            <w:tcW w:w="1474" w:type="dxa"/>
+            <w:shd w:val="clear" w:color="auto" w:fill="E2F0D9"/>
+            <w:tcMar>
+              <w:top w:w="80" w:type="dxa"/>
+              <w:left w:w="120" w:type="dxa"/>
+              <w:bottom w:w="80" w:type="dxa"/>
+              <w:right w:w="120" w:type="dxa"/>
+            </w:tcMar>
+            <w:vAlign w:val="center"/>
+          </w:tcPr>
+          <w:p>
+            <w:pPr>
+              <w:spacing w:line="252" w:lineRule="auto"/>
+            </w:pPr>
+            <w:r>
+              <w:rPr>
+                <w:sz w:val="16"/>
+              </w:rPr>
+              <w:t xml:space="preserve">Completo </w:t>
+            </w:r>
+          </w:p>
+        </w:tc>
+        <w:tc>
+          <w:tcPr>
+            <w:tcW w:w="4365" w:type="dxa"/>
+            <w:tcMar>
+              <w:top w:w="80" w:type="dxa"/>
+              <w:left w:w="120" w:type="dxa"/>
+              <w:bottom w:w="80" w:type="dxa"/>
+              <w:right w:w="120" w:type="dxa"/>
+            </w:tcMar>
+            <w:vAlign w:val="center"/>
+          </w:tcPr>
+          <w:p>
+            <w:pPr>
+              <w:spacing w:line="252" w:lineRule="auto"/>
+            </w:pPr>
+            <w:r>
+              <w:rPr>
+                <w:sz w:val="16"/>
+              </w:rPr>
+              <w:t>POST api/listas/cautela/</w:t>
+            </w:r>
+            <w:proofErr w:type="spellStart"/>
+            <w:r>
+              <w:rPr>
+                <w:sz w:val="16"/>
+              </w:rPr>
+              <w:t>upload</w:t>
+            </w:r>
+            <w:proofErr w:type="spellEnd"/>
+            <w:r>
+              <w:rPr>
+                <w:sz w:val="16"/>
+              </w:rPr>
+              <w:t xml:space="preserve">; </w:t>
+            </w:r>
+            <w:proofErr w:type="spellStart"/>
+            <w:r>
+              <w:rPr>
+                <w:sz w:val="16"/>
+              </w:rPr>
+              <w:t>ExcelDataReader</w:t>
+            </w:r>
+            <w:proofErr w:type="spellEnd"/>
+            <w:r>
+              <w:rPr>
+                <w:sz w:val="16"/>
+              </w:rPr>
+              <w:t>; DNP_IHSS.LISTA_CAUTELA.</w:t>
+            </w:r>
+          </w:p>
+        </w:tc>
+      </w:tr>
+      <w:tr>
+        <w:trPr>
+          <w:jc w:val="center"/>
+        </w:trPr>
+        <w:tc>
+          <w:tcPr>
+            <w:tcW w:w="2665" w:type="dxa"/>
+            <w:tcMar>
+              <w:top w:w="80" w:type="dxa"/>
+              <w:left w:w="120" w:type="dxa"/>
+              <w:bottom w:w="80" w:type="dxa"/>
+              <w:right w:w="120" w:type="dxa"/>
+            </w:tcMar>
+            <w:vAlign w:val="center"/>
+          </w:tcPr>
+          <w:p>
+            <w:pPr>
+              <w:spacing w:line="252" w:lineRule="auto"/>
+            </w:pPr>
+            <w:r>
+              <w:rPr>
+                <w:sz w:val="16"/>
+              </w:rPr>
               <w:t>Coincidencias patrono/empleado</w:t>
             </w:r>
           </w:p>
@@ -3336,24 +3252,24 @@
         <w:tc>
           <w:tcPr>
             <w:tcW w:w="1474" w:type="dxa"/>
-            <w:shd w:val="clear" w:color="auto" w:fill="FFF2CC"/>
-            <w:tcMar>
-              <w:top w:w="80" w:type="dxa"/>
-              <w:left w:w="120" w:type="dxa"/>
-              <w:bottom w:w="80" w:type="dxa"/>
-              <w:right w:w="120" w:type="dxa"/>
-            </w:tcMar>
-            <w:vAlign w:val="center"/>
-          </w:tcPr>
-          <w:p>
-            <w:pPr>
-              <w:spacing w:line="252" w:lineRule="auto"/>
-            </w:pPr>
-            <w:r>
-              <w:rPr>
-                <w:sz w:val="16"/>
-              </w:rPr>
-              <w:t>Parcial</w:t>
+            <w:shd w:val="clear" w:color="auto" w:fill="EAF1DD" w:themeFill="accent3" w:themeFillTint="33"/>
+            <w:tcMar>
+              <w:top w:w="80" w:type="dxa"/>
+              <w:left w:w="120" w:type="dxa"/>
+              <w:bottom w:w="80" w:type="dxa"/>
+              <w:right w:w="120" w:type="dxa"/>
+            </w:tcMar>
+            <w:vAlign w:val="center"/>
+          </w:tcPr>
+          <w:p>
+            <w:pPr>
+              <w:spacing w:line="252" w:lineRule="auto"/>
+            </w:pPr>
+            <w:r>
+              <w:rPr>
+                <w:sz w:val="16"/>
+              </w:rPr>
+              <w:t>Completo</w:t>
             </w:r>
           </w:p>
         </w:tc>
@@ -3506,13 +3422,7 @@
         <w:rPr>
           <w:sz w:val="20"/>
         </w:rPr>
-        <w:t xml:space="preserve">Ficha o perfil </w:t>
-      </w:r>
-      <w:r>
-        <w:rPr>
-          <w:sz w:val="20"/>
-        </w:rPr>
-        <w:t>individual por persona natural o jurídica.</w:t>
+        <w:t>Ficha o perfil individual por persona natural o jurídica.</w:t>
       </w:r>
     </w:p>
     <w:p>
@@ -3536,13 +3446,7 @@
         <w:rPr>
           <w:sz w:val="20"/>
         </w:rPr>
-        <w:t>Histórico de seg</w:t>
-      </w:r>
-      <w:r>
-        <w:rPr>
-          <w:sz w:val="20"/>
-        </w:rPr>
-        <w:t>uimientos con opción desde/hasta.</w:t>
+        <w:t>Histórico de seguimientos con opción desde/hasta.</w:t>
       </w:r>
     </w:p>
     <w:p>
@@ -3602,13 +3506,7 @@
         <w:rPr>
           <w:sz w:val="20"/>
         </w:rPr>
-        <w:t xml:space="preserve">Eliminación de registros </w:t>
-      </w:r>
-      <w:r>
-        <w:rPr>
-          <w:sz w:val="20"/>
-        </w:rPr>
-        <w:t>sólo por Cumplimiento, con motivo obligatorio y bitácora de documentos eliminados.</w:t>
+        <w:t>Eliminación de registros sólo por Cumplimiento, con motivo obligatorio y bitácora de documentos eliminados.</w:t>
       </w:r>
     </w:p>
     <w:p>
@@ -3767,15 +3665,7 @@
                 <w:color w:val="000000"/>
                 <w:sz w:val="17"/>
               </w:rPr>
-              <w:t>Estad</w:t>
-            </w:r>
-            <w:r>
-              <w:rPr>
-                <w:b/>
-                <w:color w:val="000000"/>
-                <w:sz w:val="17"/>
-              </w:rPr>
-              <w:t>o</w:t>
+              <w:t>Estado</w:t>
             </w:r>
           </w:p>
         </w:tc>
@@ -3917,6 +3807,9 @@
           <w:p>
             <w:pPr>
               <w:spacing w:line="252" w:lineRule="auto"/>
+              <w:rPr>
+                <w:sz w:val="16"/>
+              </w:rPr>
             </w:pPr>
             <w:r>
               <w:rPr>
@@ -3937,6 +3830,27 @@
                 <w:sz w:val="16"/>
               </w:rPr>
               <w:t>, API o carga manual temporal; documentar sincronización.</w:t>
+            </w:r>
+            <w:r>
+              <w:rPr>
+                <w:sz w:val="16"/>
+              </w:rPr>
+              <w:br/>
+            </w:r>
+          </w:p>
+          <w:p>
+            <w:pPr>
+              <w:spacing w:line="252" w:lineRule="auto"/>
+              <w:rPr>
+                <w:b/>
+              </w:rPr>
+            </w:pPr>
+            <w:r>
+              <w:rPr>
+                <w:b/>
+                <w:sz w:val="16"/>
+              </w:rPr>
+              <w:t>Detalles Pendientes</w:t>
             </w:r>
           </w:p>
         </w:tc>
@@ -3987,13 +3901,7 @@
               <w:rPr>
                 <w:sz w:val="16"/>
               </w:rPr>
-              <w:t xml:space="preserve">Datos </w:t>
-            </w:r>
-            <w:r>
-              <w:rPr>
-                <w:sz w:val="16"/>
-              </w:rPr>
-              <w:t>generales de persona natural/jurídica</w:t>
+              <w:t>Datos generales de persona natural/jurídica</w:t>
             </w:r>
           </w:p>
         </w:tc>
@@ -4037,24 +3945,33 @@
         <w:tc>
           <w:tcPr>
             <w:tcW w:w="1247" w:type="dxa"/>
-            <w:shd w:val="clear" w:color="auto" w:fill="FFF2CC"/>
-            <w:tcMar>
-              <w:top w:w="80" w:type="dxa"/>
-              <w:left w:w="120" w:type="dxa"/>
-              <w:bottom w:w="80" w:type="dxa"/>
-              <w:right w:w="120" w:type="dxa"/>
-            </w:tcMar>
-            <w:vAlign w:val="center"/>
-          </w:tcPr>
-          <w:p>
-            <w:pPr>
-              <w:spacing w:line="252" w:lineRule="auto"/>
-            </w:pPr>
-            <w:r>
-              <w:rPr>
-                <w:sz w:val="16"/>
-              </w:rPr>
-              <w:t>Parcial</w:t>
+            <w:shd w:val="clear" w:color="auto" w:fill="EAF1DD" w:themeFill="accent3" w:themeFillTint="33"/>
+            <w:tcMar>
+              <w:top w:w="80" w:type="dxa"/>
+              <w:left w:w="120" w:type="dxa"/>
+              <w:bottom w:w="80" w:type="dxa"/>
+              <w:right w:w="120" w:type="dxa"/>
+            </w:tcMar>
+            <w:vAlign w:val="center"/>
+          </w:tcPr>
+          <w:p>
+            <w:pPr>
+              <w:spacing w:line="252" w:lineRule="auto"/>
+              <w:rPr>
+                <w:sz w:val="16"/>
+              </w:rPr>
+            </w:pPr>
+            <w:r>
+              <w:rPr>
+                <w:sz w:val="16"/>
+              </w:rPr>
+              <w:t>Completo</w:t>
+            </w:r>
+            <w:r>
+              <w:rPr>
+                <w:sz w:val="16"/>
+              </w:rPr>
+              <w:t xml:space="preserve"> con Mejoras</w:t>
             </w:r>
           </w:p>
         </w:tc>
@@ -4219,6 +4136,8 @@
               </w:rPr>
               <w:t>Completo</w:t>
             </w:r>
+            <w:bookmarkStart w:id="0" w:name="_GoBack"/>
+            <w:bookmarkEnd w:id="0"/>
           </w:p>
         </w:tc>
         <w:tc>
@@ -4240,13 +4159,7 @@
               <w:rPr>
                 <w:sz w:val="16"/>
               </w:rPr>
-              <w:t>Validar formato visible e</w:t>
-            </w:r>
-            <w:r>
-              <w:rPr>
-                <w:sz w:val="16"/>
-              </w:rPr>
-              <w:t>n ficha final.</w:t>
+              <w:t>Validar formato visible en ficha final.</w:t>
             </w:r>
           </w:p>
         </w:tc>
@@ -4683,6 +4596,7 @@
               <w:rPr>
                 <w:sz w:val="16"/>
               </w:rPr>
+              <w:lastRenderedPageBreak/>
               <w:t>7</w:t>
             </w:r>
           </w:p>
@@ -4706,13 +4620,7 @@
               <w:rPr>
                 <w:sz w:val="16"/>
               </w:rPr>
-              <w:t xml:space="preserve">Fecha de </w:t>
-            </w:r>
-            <w:r>
-              <w:rPr>
-                <w:sz w:val="16"/>
-              </w:rPr>
-              <w:t>seguimiento</w:t>
+              <w:t>Fecha de seguimiento</w:t>
             </w:r>
           </w:p>
         </w:tc>
@@ -4742,7 +4650,6 @@
               <w:rPr>
                 <w:sz w:val="16"/>
               </w:rPr>
-              <w:lastRenderedPageBreak/>
               <w:t>fechaCreacion</w:t>
             </w:r>
             <w:proofErr w:type="spellEnd"/>
@@ -4774,15 +4681,7 @@
               <w:rPr>
                 <w:sz w:val="16"/>
               </w:rPr>
-              <w:lastRenderedPageBreak/>
-              <w:t xml:space="preserve">Completo con </w:t>
-            </w:r>
-            <w:r>
-              <w:rPr>
-                <w:sz w:val="16"/>
-              </w:rPr>
-              <w:lastRenderedPageBreak/>
-              <w:t>mejora</w:t>
+              <w:t>Completo con mejora</w:t>
             </w:r>
           </w:p>
         </w:tc>
@@ -4805,15 +4704,7 @@
               <w:rPr>
                 <w:sz w:val="16"/>
               </w:rPr>
-              <w:lastRenderedPageBreak/>
-              <w:t xml:space="preserve">Agregar filtro desde/hasta en </w:t>
-            </w:r>
-            <w:r>
-              <w:rPr>
-                <w:sz w:val="16"/>
-              </w:rPr>
-              <w:lastRenderedPageBreak/>
-              <w:t>consulta y perfil.</w:t>
+              <w:t>Agregar filtro desde/hasta en consulta y perfil.</w:t>
             </w:r>
           </w:p>
         </w:tc>
@@ -4841,7 +4732,6 @@
               <w:rPr>
                 <w:sz w:val="16"/>
               </w:rPr>
-              <w:lastRenderedPageBreak/>
               <w:t>8</w:t>
             </w:r>
           </w:p>
@@ -4935,13 +4825,7 @@
               <w:rPr>
                 <w:sz w:val="16"/>
               </w:rPr>
-              <w:t xml:space="preserve">Separar motivo inicial de seguimiento si Cumplimiento lo </w:t>
-            </w:r>
-            <w:r>
-              <w:rPr>
-                <w:sz w:val="16"/>
-              </w:rPr>
-              <w:t>requiere.</w:t>
+              <w:t>Separar motivo inicial de seguimiento si Cumplimiento lo requiere.</w:t>
             </w:r>
           </w:p>
         </w:tc>
@@ -5183,13 +5067,7 @@
               <w:rPr>
                 <w:sz w:val="16"/>
               </w:rPr>
-              <w:t xml:space="preserve">Implementar filtros y </w:t>
-            </w:r>
-            <w:r>
-              <w:rPr>
-                <w:sz w:val="16"/>
-              </w:rPr>
-              <w:t>exportación con rango.</w:t>
+              <w:t>Implementar filtros y exportación con rango.</w:t>
             </w:r>
           </w:p>
         </w:tc>
@@ -5445,13 +5323,7 @@
               <w:rPr>
                 <w:sz w:val="16"/>
               </w:rPr>
-              <w:t>Alinear campos manuales co</w:t>
-            </w:r>
-            <w:r>
-              <w:rPr>
-                <w:sz w:val="16"/>
-              </w:rPr>
-              <w:t>n perfil completo del memorando.</w:t>
+              <w:t>Alinear campos manuales con perfil completo del memorando.</w:t>
             </w:r>
           </w:p>
         </w:tc>
@@ -5822,13 +5694,7 @@
               <w:rPr>
                 <w:sz w:val="16"/>
               </w:rPr>
-              <w:t>Impleme</w:t>
-            </w:r>
-            <w:r>
-              <w:rPr>
-                <w:sz w:val="16"/>
-              </w:rPr>
-              <w:t>ntar control por permiso/rol, motivo obligatorio y auditoría.</w:t>
+              <w:t>Implementar control por permiso/rol, motivo obligatorio y auditoría.</w:t>
             </w:r>
           </w:p>
         </w:tc>
@@ -5949,13 +5815,7 @@
               <w:rPr>
                 <w:sz w:val="16"/>
               </w:rPr>
-              <w:t xml:space="preserve">Crear bitácora específica o ampliar auditoría con motivo </w:t>
-            </w:r>
-            <w:r>
-              <w:rPr>
-                <w:sz w:val="16"/>
-              </w:rPr>
-              <w:t>y datos de documento.</w:t>
+              <w:t>Crear bitácora específica o ampliar auditoría con motivo y datos de documento.</w:t>
             </w:r>
           </w:p>
         </w:tc>
@@ -6219,13 +6079,7 @@
               <w:rPr>
                 <w:sz w:val="16"/>
               </w:rPr>
-              <w:t xml:space="preserve"> con </w:t>
-            </w:r>
-            <w:r>
-              <w:rPr>
-                <w:sz w:val="16"/>
-              </w:rPr>
-              <w:t xml:space="preserve">endpoints principales; </w:t>
+              <w:t xml:space="preserve"> con endpoints principales; </w:t>
             </w:r>
             <w:proofErr w:type="spellStart"/>
             <w:r>
@@ -6312,13 +6166,7 @@
               <w:rPr>
                 <w:sz w:val="16"/>
               </w:rPr>
-              <w:t>, rutas base, exportación PDF/Excel, manejo de formularios, filtros en memoria y</w:t>
-            </w:r>
-            <w:r>
-              <w:rPr>
-                <w:sz w:val="16"/>
-              </w:rPr>
-              <w:t xml:space="preserve"> evidencias.</w:t>
+              <w:t>, rutas base, exportación PDF/Excel, manejo de formularios, filtros en memoria y evidencias.</w:t>
             </w:r>
           </w:p>
         </w:tc>
@@ -6420,13 +6268,7 @@
               <w:rPr>
                 <w:sz w:val="16"/>
               </w:rPr>
-              <w:t>Uso de DNP_IHSS.REPORTE_COINCIDENCIAS, DNP_IHSS.TIPO_LISTAS_CAUTELA y DNP_IHSS.LISTA</w:t>
-            </w:r>
-            <w:r>
-              <w:rPr>
-                <w:sz w:val="16"/>
-              </w:rPr>
-              <w:t>_CAUTELA.</w:t>
+              <w:t>Uso de DNP_IHSS.REPORTE_COINCIDENCIAS, DNP_IHSS.TIPO_LISTAS_CAUTELA y DNP_IHSS.LISTA_CAUTELA.</w:t>
             </w:r>
           </w:p>
         </w:tc>
@@ -6691,13 +6533,7 @@
               <w:rPr>
                 <w:sz w:val="16"/>
               </w:rPr>
-              <w:t xml:space="preserve">Resolver calificación DNP vs </w:t>
-            </w:r>
-            <w:r>
-              <w:rPr>
-                <w:sz w:val="16"/>
-              </w:rPr>
-              <w:t>RL_CALIF_COINCIDENCIAS.</w:t>
+              <w:t>Resolver calificación DNP vs RL_CALIF_COINCIDENCIAS.</w:t>
             </w:r>
           </w:p>
         </w:tc>
@@ -6845,13 +6681,7 @@
               <w:rPr>
                 <w:sz w:val="16"/>
               </w:rPr>
-              <w:t xml:space="preserve">Completar </w:t>
-            </w:r>
-            <w:r>
-              <w:rPr>
-                <w:sz w:val="16"/>
-              </w:rPr>
-              <w:t>ficha/perfil PDF y Excel según memorando.</w:t>
+              <w:t>Completar ficha/perfil PDF y Excel según memorando.</w:t>
             </w:r>
           </w:p>
         </w:tc>
@@ -6999,13 +6829,7 @@
               <w:rPr>
                 <w:sz w:val="16"/>
               </w:rPr>
-              <w:t>Validar evidencias en backend por extensión, MIME, tamaño y ruta segu</w:t>
-            </w:r>
-            <w:r>
-              <w:rPr>
-                <w:sz w:val="16"/>
-              </w:rPr>
-              <w:t>ra.</w:t>
+              <w:t>Validar evidencias en backend por extensión, MIME, tamaño y ruta segura.</w:t>
             </w:r>
           </w:p>
         </w:tc>
@@ -7205,13 +7029,7 @@
         <w:rPr>
           <w:sz w:val="20"/>
         </w:rPr>
-        <w:t xml:space="preserve">Script SQL </w:t>
-      </w:r>
-      <w:r>
-        <w:rPr>
-          <w:sz w:val="20"/>
-        </w:rPr>
-        <w:t>incremental para bitácora de eliminaciones o ampliación formal de auditoría con motivo obligatorio.</w:t>
+        <w:t>Script SQL incremental para bitácora de eliminaciones o ampliación formal de auditoría con motivo obligatorio.</w:t>
       </w:r>
     </w:p>
     <w:p>
@@ -7247,13 +7065,7 @@
         <w:rPr>
           <w:sz w:val="20"/>
         </w:rPr>
-        <w:t>Ajust</w:t>
-      </w:r>
-      <w:r>
-        <w:rPr>
-          <w:sz w:val="20"/>
-        </w:rPr>
-        <w:t>e backend para usar RL_CALIF_COINCIDENCIAS como fuente si DNP no permite UPDATE.</w:t>
+        <w:t>Ajuste backend para usar RL_CALIF_COINCIDENCIAS como fuente si DNP no permite UPDATE.</w:t>
       </w:r>
     </w:p>
     <w:p>
@@ -7301,13 +7113,7 @@
         <w:rPr>
           <w:sz w:val="20"/>
         </w:rPr>
-        <w:t>Validación backend d</w:t>
-      </w:r>
-      <w:r>
-        <w:rPr>
-          <w:sz w:val="20"/>
-        </w:rPr>
-        <w:t>e archivos por política GTIC.</w:t>
+        <w:t>Validación backend de archivos por política GTIC.</w:t>
       </w:r>
     </w:p>
     <w:p>
@@ -7352,10 +7158,7 @@
         <w:spacing w:after="120" w:line="264" w:lineRule="auto"/>
       </w:pPr>
       <w:r>
-        <w:t>La resolución es cerrar primero seguridad, audito</w:t>
-      </w:r>
-      <w:r>
-        <w:t>ría y consistencia de datos; después cerrar la ficha/perfil y reportería; finalmente agregar seguimiento de noticias y normalización de estados. El desarrollo debe hacerse sobre los archivos existentes, sin cambiar arquitectura ni nomenclatura.</w:t>
+        <w:t>La resolución es cerrar primero seguridad, auditoría y consistencia de datos; después cerrar la ficha/perfil y reportería; finalmente agregar seguimiento de noticias y normalización de estados. El desarrollo debe hacerse sobre los archivos existentes, sin cambiar arquitectura ni nomenclatura.</w:t>
       </w:r>
     </w:p>
     <w:tbl>
@@ -7398,15 +7201,7 @@
                 <w:color w:val="000000"/>
                 <w:sz w:val="17"/>
               </w:rPr>
-              <w:t>Bloque de e</w:t>
-            </w:r>
-            <w:r>
-              <w:rPr>
-                <w:b/>
-                <w:color w:val="000000"/>
-                <w:sz w:val="17"/>
-              </w:rPr>
-              <w:t>jecución</w:t>
+              <w:t>Bloque de ejecución</w:t>
             </w:r>
           </w:p>
         </w:tc>
@@ -7698,13 +7493,7 @@
               <w:rPr>
                 <w:sz w:val="16"/>
               </w:rPr>
-              <w:t xml:space="preserve"> para tabla local</w:t>
-            </w:r>
-            <w:r>
-              <w:rPr>
-                <w:sz w:val="16"/>
-              </w:rPr>
-              <w:t xml:space="preserve"> si no hay UPDATE DNP.</w:t>
+              <w:t xml:space="preserve"> para tabla local si no hay UPDATE DNP.</w:t>
             </w:r>
           </w:p>
         </w:tc>
@@ -7875,13 +7664,7 @@
               <w:rPr>
                 <w:sz w:val="16"/>
               </w:rPr>
-              <w:t>Asegurar campo</w:t>
-            </w:r>
-            <w:r>
-              <w:rPr>
-                <w:sz w:val="16"/>
-              </w:rPr>
-              <w:t>s fuente.</w:t>
+              <w:t>Asegurar campos fuente.</w:t>
             </w:r>
           </w:p>
         </w:tc>
@@ -8134,13 +7917,7 @@
               <w:rPr>
                 <w:sz w:val="16"/>
               </w:rPr>
-              <w:t xml:space="preserve">Validación </w:t>
-            </w:r>
-            <w:r>
-              <w:rPr>
-                <w:sz w:val="16"/>
-              </w:rPr>
-              <w:t>extensión/MIME/MB/ruta.</w:t>
+              <w:t>Validación extensión/MIME/MB/ruta.</w:t>
             </w:r>
           </w:p>
         </w:tc>
@@ -8629,13 +8406,7 @@
               <w:rPr>
                 <w:sz w:val="16"/>
               </w:rPr>
-              <w:t>a</w:t>
-            </w:r>
-            <w:r>
-              <w:rPr>
-                <w:sz w:val="16"/>
-              </w:rPr>
-              <w:t>dmin</w:t>
+              <w:t>admin</w:t>
             </w:r>
             <w:proofErr w:type="spellEnd"/>
             <w:r>
@@ -8833,13 +8604,7 @@
               <w:rPr>
                 <w:sz w:val="16"/>
               </w:rPr>
-              <w:t>05_register_monitoreo_list</w:t>
-            </w:r>
-            <w:r>
-              <w:rPr>
-                <w:sz w:val="16"/>
-              </w:rPr>
-              <w:t>as.sql; 09_create_detalle_evidencia.sql; 10_register_tipo_listas_module.sql; 11_register_cargar_listas_module.sql; 12_register_coincidencias_patrono_module.sql; 13_create_calificaciones_coincidencias.sql; 14_register_coincidencias_empleado_module.sql.</w:t>
+              <w:t>05_register_monitoreo_listas.sql; 09_create_detalle_evidencia.sql; 10_register_tipo_listas_module.sql; 11_register_cargar_listas_module.sql; 12_register_coincidencias_patrono_module.sql; 13_create_calificaciones_coincidencias.sql; 14_register_coincidencias_empleado_module.sql.</w:t>
             </w:r>
           </w:p>
         </w:tc>
@@ -8867,13 +8632,7 @@
               <w:rPr>
                 <w:sz w:val="16"/>
               </w:rPr>
-              <w:t>Tra</w:t>
-            </w:r>
-            <w:r>
-              <w:rPr>
-                <w:sz w:val="16"/>
-              </w:rPr>
-              <w:t>nsversales</w:t>
+              <w:t>Transversales</w:t>
             </w:r>
           </w:p>
         </w:tc>
@@ -9031,13 +8790,7 @@
         <w:rPr>
           <w:sz w:val="20"/>
         </w:rPr>
-        <w:t xml:space="preserve">Crear respaldo de estado actual y revisar ramas/cambios </w:t>
-      </w:r>
-      <w:r>
-        <w:rPr>
-          <w:sz w:val="20"/>
-        </w:rPr>
-        <w:t>no confirmados.</w:t>
+        <w:t>Crear respaldo de estado actual y revisar ramas/cambios no confirmados.</w:t>
       </w:r>
     </w:p>
     <w:p>
@@ -9099,13 +8852,7 @@
         <w:rPr>
           <w:sz w:val="20"/>
         </w:rPr>
-        <w:t>Agregar validación backend de archivos y política de tamaño/t</w:t>
-      </w:r>
-      <w:r>
-        <w:rPr>
-          <w:sz w:val="20"/>
-        </w:rPr>
-        <w:t>ipo.</w:t>
+        <w:t>Agregar validación backend de archivos y política de tamaño/tipo.</w:t>
       </w:r>
     </w:p>
     <w:p>
@@ -9165,13 +8912,7 @@
         <w:rPr>
           <w:sz w:val="20"/>
         </w:rPr>
-        <w:t xml:space="preserve">Probar regresión completa de módulos base y </w:t>
-      </w:r>
-      <w:r>
-        <w:rPr>
-          <w:sz w:val="20"/>
-        </w:rPr>
-        <w:t>Monitoreo de Listas.</w:t>
+        <w:t>Probar regresión completa de módulos base y Monitoreo de Listas.</w:t>
       </w:r>
     </w:p>
     <w:p>
@@ -9368,13 +9109,7 @@
               <w:rPr>
                 <w:sz w:val="16"/>
               </w:rPr>
-              <w:t xml:space="preserve">Toda eliminación, impresión, exportación y cambio crítico debe registrarse con usuario, fecha y </w:t>
-            </w:r>
-            <w:r>
-              <w:rPr>
-                <w:sz w:val="16"/>
-              </w:rPr>
-              <w:t>detalle.</w:t>
+              <w:t>Toda eliminación, impresión, exportación y cambio crítico debe registrarse con usuario, fecha y detalle.</w:t>
             </w:r>
           </w:p>
         </w:tc>
@@ -9527,13 +9262,7 @@
               <w:rPr>
                 <w:sz w:val="16"/>
               </w:rPr>
-              <w:t>Debe poder imprimirse/exportarse por rango desde/</w:t>
-            </w:r>
-            <w:r>
-              <w:rPr>
-                <w:sz w:val="16"/>
-              </w:rPr>
-              <w:t>hasta.</w:t>
+              <w:t>Debe poder imprimirse/exportarse por rango desde/hasta.</w:t>
             </w:r>
           </w:p>
         </w:tc>
@@ -9686,13 +9415,7 @@
               <w:rPr>
                 <w:sz w:val="16"/>
               </w:rPr>
-              <w:t xml:space="preserve">No debe romper usuarios, configuración, bitácora, tipo listas, </w:t>
-            </w:r>
-            <w:r>
-              <w:rPr>
-                <w:sz w:val="16"/>
-              </w:rPr>
-              <w:t>carga listas ni coincidencias.</w:t>
+              <w:t>No debe romper usuarios, configuración, bitácora, tipo listas, carga listas ni coincidencias.</w:t>
             </w:r>
           </w:p>
         </w:tc>
@@ -9878,13 +9601,7 @@
               <w:rPr>
                 <w:sz w:val="16"/>
               </w:rPr>
-              <w:t xml:space="preserve">Motivo obligatorio y bitácora </w:t>
-            </w:r>
-            <w:r>
-              <w:rPr>
-                <w:sz w:val="16"/>
-              </w:rPr>
-              <w:t>de documentos eliminados.</w:t>
+              <w:t>Motivo obligatorio y bitácora de documentos eliminados.</w:t>
             </w:r>
           </w:p>
         </w:tc>
@@ -10055,13 +9772,7 @@
               <w:rPr>
                 <w:sz w:val="16"/>
               </w:rPr>
-              <w:t xml:space="preserve"> </w:t>
-            </w:r>
-            <w:r>
-              <w:rPr>
-                <w:sz w:val="16"/>
-              </w:rPr>
-              <w:t>en rutas y validación API para acciones sensibles.</w:t>
+              <w:t xml:space="preserve"> en rutas y validación API para acciones sensibles.</w:t>
             </w:r>
           </w:p>
         </w:tc>
@@ -10151,13 +9862,7 @@
         <w:spacing w:after="120" w:line="264" w:lineRule="auto"/>
       </w:pPr>
       <w:r>
-        <w:t>Los módulos base y Monitoreo de Listas ya tienen una base funcional importante</w:t>
-      </w:r>
-      <w:r>
-        <w:t>, pero todavía no están listos para darse por cerrados frente al cliente. El cierre debe concentrarse en permisos, auditoría, eliminación controlada, ficha PDF/Excel, históricos por rango, validación de evidencias, calificación consistente y seguimiento de</w:t>
-      </w:r>
-      <w:r>
-        <w:t xml:space="preserve"> noticias.</w:t>
+        <w:t>Los módulos base y Monitoreo de Listas ya tienen una base funcional importante, pero todavía no están listos para darse por cerrados frente al cliente. El cierre debe concentrarse en permisos, auditoría, eliminación controlada, ficha PDF/Excel, históricos por rango, validación de evidencias, calificación consistente y seguimiento de noticias.</w:t>
       </w:r>
     </w:p>
     <w:p>
@@ -10424,7 +10129,7 @@
   <w:abstractNum w:abstractNumId="8">
     <w:nsid w:val="FFFFFF89"/>
     <w:multiLevelType w:val="singleLevel"/>
-    <w:tmpl w:val="29761A62"/>
+    <w:tmpl w:val="BD5270AA"/>
     <w:lvl w:ilvl="0">
       <w:start w:val="1"/>
       <w:numFmt w:val="bullet"/>
@@ -22902,7 +22607,7 @@
 </file>
 
 <file path=customXml/itemProps1.xml><?xml version="1.0" encoding="utf-8"?>
-<ds:datastoreItem xmlns:ds="http://schemas.openxmlformats.org/officeDocument/2006/customXml" ds:itemID="{8363441F-E010-4C5B-93B9-B25DC97234C7}">
+<ds:datastoreItem xmlns:ds="http://schemas.openxmlformats.org/officeDocument/2006/customXml" ds:itemID="{DDA5D964-8107-47EF-A04A-C7CC393A54A2}">
   <ds:schemaRefs>
     <ds:schemaRef ds:uri="http://schemas.openxmlformats.org/officeDocument/2006/bibliography"/>
   </ds:schemaRefs>

</xml_diff>

<commit_message>
Add evidence deletion reasons and origin tracking
</commit_message>
<xml_diff>
--- a/docs/Cierre_Final_Modulos_Base_Monitoreo_Listas.docx
+++ b/docs/Cierre_Final_Modulos_Base_Monitoreo_Listas.docx
@@ -3989,12 +3989,37 @@
           <w:p>
             <w:pPr>
               <w:spacing w:line="252" w:lineRule="auto"/>
+              <w:rPr>
+                <w:sz w:val="16"/>
+              </w:rPr>
             </w:pPr>
             <w:r>
               <w:rPr>
                 <w:sz w:val="16"/>
               </w:rPr>
               <w:t>Alinear ficha completa con todos los campos del memorando.</w:t>
+            </w:r>
+          </w:p>
+          <w:p>
+            <w:pPr>
+              <w:spacing w:before="100" w:beforeAutospacing="1" w:after="100" w:afterAutospacing="1"/>
+              <w:rPr>
+                <w:rFonts w:ascii="Times New Roman" w:eastAsia="Times New Roman" w:hAnsi="Times New Roman" w:cs="Times New Roman"/>
+                <w:b/>
+                <w:sz w:val="16"/>
+                <w:szCs w:val="16"/>
+                <w:lang w:val="es-HN" w:eastAsia="es-HN"/>
+              </w:rPr>
+            </w:pPr>
+            <w:r>
+              <w:rPr>
+                <w:rFonts w:ascii="Times New Roman" w:eastAsia="Times New Roman" w:hAnsi="Times New Roman" w:cs="Times New Roman"/>
+                <w:b/>
+                <w:sz w:val="16"/>
+                <w:szCs w:val="16"/>
+                <w:lang w:val="es-HN" w:eastAsia="es-HN"/>
+              </w:rPr>
+              <w:t>Pendiente solo de validar el formato exacto del memorando final.</w:t>
             </w:r>
           </w:p>
         </w:tc>
@@ -4136,8 +4161,6 @@
               </w:rPr>
               <w:t>Completo</w:t>
             </w:r>
-            <w:bookmarkStart w:id="0" w:name="_GoBack"/>
-            <w:bookmarkEnd w:id="0"/>
           </w:p>
         </w:tc>
         <w:tc>
@@ -4451,6 +4474,7 @@
               <w:rPr>
                 <w:sz w:val="16"/>
               </w:rPr>
+              <w:lastRenderedPageBreak/>
               <w:t>6</w:t>
             </w:r>
           </w:p>
@@ -4528,24 +4552,24 @@
         <w:tc>
           <w:tcPr>
             <w:tcW w:w="1247" w:type="dxa"/>
-            <w:shd w:val="clear" w:color="auto" w:fill="FFF2CC"/>
-            <w:tcMar>
-              <w:top w:w="80" w:type="dxa"/>
-              <w:left w:w="120" w:type="dxa"/>
-              <w:bottom w:w="80" w:type="dxa"/>
-              <w:right w:w="120" w:type="dxa"/>
-            </w:tcMar>
-            <w:vAlign w:val="center"/>
-          </w:tcPr>
-          <w:p>
-            <w:pPr>
-              <w:spacing w:line="252" w:lineRule="auto"/>
-            </w:pPr>
-            <w:r>
-              <w:rPr>
-                <w:sz w:val="16"/>
-              </w:rPr>
-              <w:t>Parcial</w:t>
+            <w:shd w:val="clear" w:color="auto" w:fill="EAF1DD" w:themeFill="accent3" w:themeFillTint="33"/>
+            <w:tcMar>
+              <w:top w:w="80" w:type="dxa"/>
+              <w:left w:w="120" w:type="dxa"/>
+              <w:bottom w:w="80" w:type="dxa"/>
+              <w:right w:w="120" w:type="dxa"/>
+            </w:tcMar>
+            <w:vAlign w:val="center"/>
+          </w:tcPr>
+          <w:p>
+            <w:pPr>
+              <w:spacing w:line="252" w:lineRule="auto"/>
+            </w:pPr>
+            <w:r>
+              <w:rPr>
+                <w:sz w:val="16"/>
+              </w:rPr>
+              <w:t>Completo</w:t>
             </w:r>
           </w:p>
         </w:tc>
@@ -4596,7 +4620,6 @@
               <w:rPr>
                 <w:sz w:val="16"/>
               </w:rPr>
-              <w:lastRenderedPageBreak/>
               <w:t>7</w:t>
             </w:r>
           </w:p>
@@ -4681,7 +4704,7 @@
               <w:rPr>
                 <w:sz w:val="16"/>
               </w:rPr>
-              <w:t>Completo con mejora</w:t>
+              <w:t xml:space="preserve">Completo </w:t>
             </w:r>
           </w:p>
         </w:tc>
@@ -4906,24 +4929,24 @@
         <w:tc>
           <w:tcPr>
             <w:tcW w:w="1247" w:type="dxa"/>
-            <w:shd w:val="clear" w:color="auto" w:fill="FFF2CC"/>
-            <w:tcMar>
-              <w:top w:w="80" w:type="dxa"/>
-              <w:left w:w="120" w:type="dxa"/>
-              <w:bottom w:w="80" w:type="dxa"/>
-              <w:right w:w="120" w:type="dxa"/>
-            </w:tcMar>
-            <w:vAlign w:val="center"/>
-          </w:tcPr>
-          <w:p>
-            <w:pPr>
-              <w:spacing w:line="252" w:lineRule="auto"/>
-            </w:pPr>
-            <w:r>
-              <w:rPr>
-                <w:sz w:val="16"/>
-              </w:rPr>
-              <w:t>Parcial</w:t>
+            <w:shd w:val="clear" w:color="auto" w:fill="EAF1DD" w:themeFill="accent3" w:themeFillTint="33"/>
+            <w:tcMar>
+              <w:top w:w="80" w:type="dxa"/>
+              <w:left w:w="120" w:type="dxa"/>
+              <w:bottom w:w="80" w:type="dxa"/>
+              <w:right w:w="120" w:type="dxa"/>
+            </w:tcMar>
+            <w:vAlign w:val="center"/>
+          </w:tcPr>
+          <w:p>
+            <w:pPr>
+              <w:spacing w:line="252" w:lineRule="auto"/>
+            </w:pPr>
+            <w:r>
+              <w:rPr>
+                <w:sz w:val="16"/>
+              </w:rPr>
+              <w:t>Completo</w:t>
             </w:r>
           </w:p>
         </w:tc>
@@ -5027,24 +5050,24 @@
         <w:tc>
           <w:tcPr>
             <w:tcW w:w="1247" w:type="dxa"/>
-            <w:shd w:val="clear" w:color="auto" w:fill="FFF2CC"/>
-            <w:tcMar>
-              <w:top w:w="80" w:type="dxa"/>
-              <w:left w:w="120" w:type="dxa"/>
-              <w:bottom w:w="80" w:type="dxa"/>
-              <w:right w:w="120" w:type="dxa"/>
-            </w:tcMar>
-            <w:vAlign w:val="center"/>
-          </w:tcPr>
-          <w:p>
-            <w:pPr>
-              <w:spacing w:line="252" w:lineRule="auto"/>
-            </w:pPr>
-            <w:r>
-              <w:rPr>
-                <w:sz w:val="16"/>
-              </w:rPr>
-              <w:t>Parcial</w:t>
+            <w:shd w:val="clear" w:color="auto" w:fill="EAF1DD" w:themeFill="accent3" w:themeFillTint="33"/>
+            <w:tcMar>
+              <w:top w:w="80" w:type="dxa"/>
+              <w:left w:w="120" w:type="dxa"/>
+              <w:bottom w:w="80" w:type="dxa"/>
+              <w:right w:w="120" w:type="dxa"/>
+            </w:tcMar>
+            <w:vAlign w:val="center"/>
+          </w:tcPr>
+          <w:p>
+            <w:pPr>
+              <w:spacing w:line="252" w:lineRule="auto"/>
+            </w:pPr>
+            <w:r>
+              <w:rPr>
+                <w:sz w:val="16"/>
+              </w:rPr>
+              <w:t>Completo</w:t>
             </w:r>
           </w:p>
         </w:tc>
@@ -5148,24 +5171,24 @@
         <w:tc>
           <w:tcPr>
             <w:tcW w:w="1247" w:type="dxa"/>
-            <w:shd w:val="clear" w:color="auto" w:fill="FFF2CC"/>
-            <w:tcMar>
-              <w:top w:w="80" w:type="dxa"/>
-              <w:left w:w="120" w:type="dxa"/>
-              <w:bottom w:w="80" w:type="dxa"/>
-              <w:right w:w="120" w:type="dxa"/>
-            </w:tcMar>
-            <w:vAlign w:val="center"/>
-          </w:tcPr>
-          <w:p>
-            <w:pPr>
-              <w:spacing w:line="252" w:lineRule="auto"/>
-            </w:pPr>
-            <w:r>
-              <w:rPr>
-                <w:sz w:val="16"/>
-              </w:rPr>
-              <w:t>Parcial</w:t>
+            <w:shd w:val="clear" w:color="auto" w:fill="EAF1DD" w:themeFill="accent3" w:themeFillTint="33"/>
+            <w:tcMar>
+              <w:top w:w="80" w:type="dxa"/>
+              <w:left w:w="120" w:type="dxa"/>
+              <w:bottom w:w="80" w:type="dxa"/>
+              <w:right w:w="120" w:type="dxa"/>
+            </w:tcMar>
+            <w:vAlign w:val="center"/>
+          </w:tcPr>
+          <w:p>
+            <w:pPr>
+              <w:spacing w:line="252" w:lineRule="auto"/>
+            </w:pPr>
+            <w:r>
+              <w:rPr>
+                <w:sz w:val="16"/>
+              </w:rPr>
+              <w:t>Completo</w:t>
             </w:r>
           </w:p>
         </w:tc>
@@ -5302,6 +5325,18 @@
               </w:rPr>
               <w:t>Parcial</w:t>
             </w:r>
+            <w:r>
+              <w:rPr>
+                <w:sz w:val="16"/>
+              </w:rPr>
+              <w:t xml:space="preserve"> </w:t>
+            </w:r>
+            <w:r>
+              <w:rPr>
+                <w:sz w:val="16"/>
+              </w:rPr>
+              <w:t>con mejora aplicada</w:t>
+            </w:r>
           </w:p>
         </w:tc>
         <w:tc>
@@ -5429,7 +5464,7 @@
               <w:rPr>
                 <w:sz w:val="16"/>
               </w:rPr>
-              <w:t>Parcial</w:t>
+              <w:t>Completo con observación</w:t>
             </w:r>
           </w:p>
         </w:tc>
@@ -5447,12 +5482,163 @@
           <w:p>
             <w:pPr>
               <w:spacing w:line="252" w:lineRule="auto"/>
+              <w:rPr>
+                <w:sz w:val="16"/>
+              </w:rPr>
             </w:pPr>
             <w:r>
               <w:rPr>
                 <w:sz w:val="16"/>
               </w:rPr>
               <w:t>Permitir evidencia por todo proceso aplicable y validar política GTIC.</w:t>
+            </w:r>
+          </w:p>
+          <w:p>
+            <w:pPr>
+              <w:spacing w:line="252" w:lineRule="auto"/>
+              <w:rPr>
+                <w:sz w:val="16"/>
+              </w:rPr>
+            </w:pPr>
+          </w:p>
+          <w:p>
+            <w:pPr>
+              <w:spacing w:line="252" w:lineRule="auto"/>
+              <w:rPr>
+                <w:b/>
+                <w:sz w:val="16"/>
+                <w:szCs w:val="16"/>
+              </w:rPr>
+            </w:pPr>
+            <w:r>
+              <w:rPr>
+                <w:b/>
+                <w:sz w:val="16"/>
+                <w:szCs w:val="16"/>
+              </w:rPr>
+              <w:t>Evidencias cubiertas por seguimiento; si el cliente requiere documentos generales del monitoreo, se recomienda ampliación controlada de RL_DETALLE_EVIDENCIA</w:t>
+            </w:r>
+          </w:p>
+        </w:tc>
+      </w:tr>
+      <w:tr>
+        <w:trPr>
+          <w:trHeight w:val="747"/>
+          <w:jc w:val="center"/>
+        </w:trPr>
+        <w:tc>
+          <w:tcPr>
+            <w:tcW w:w="567" w:type="dxa"/>
+            <w:tcMar>
+              <w:top w:w="80" w:type="dxa"/>
+              <w:left w:w="120" w:type="dxa"/>
+              <w:bottom w:w="80" w:type="dxa"/>
+              <w:right w:w="120" w:type="dxa"/>
+            </w:tcMar>
+            <w:vAlign w:val="center"/>
+          </w:tcPr>
+          <w:p>
+            <w:pPr>
+              <w:spacing w:line="252" w:lineRule="auto"/>
+            </w:pPr>
+            <w:r>
+              <w:rPr>
+                <w:sz w:val="16"/>
+              </w:rPr>
+              <w:t>14</w:t>
+            </w:r>
+          </w:p>
+        </w:tc>
+        <w:tc>
+          <w:tcPr>
+            <w:tcW w:w="2494" w:type="dxa"/>
+            <w:tcMar>
+              <w:top w:w="80" w:type="dxa"/>
+              <w:left w:w="120" w:type="dxa"/>
+              <w:bottom w:w="80" w:type="dxa"/>
+              <w:right w:w="120" w:type="dxa"/>
+            </w:tcMar>
+            <w:vAlign w:val="center"/>
+          </w:tcPr>
+          <w:p>
+            <w:pPr>
+              <w:spacing w:line="252" w:lineRule="auto"/>
+            </w:pPr>
+            <w:r>
+              <w:rPr>
+                <w:sz w:val="16"/>
+              </w:rPr>
+              <w:t>Tipo de archivo y MB por criterio GTIC</w:t>
+            </w:r>
+          </w:p>
+        </w:tc>
+        <w:tc>
+          <w:tcPr>
+            <w:tcW w:w="2324" w:type="dxa"/>
+            <w:tcMar>
+              <w:top w:w="80" w:type="dxa"/>
+              <w:left w:w="120" w:type="dxa"/>
+              <w:bottom w:w="80" w:type="dxa"/>
+              <w:right w:w="120" w:type="dxa"/>
+            </w:tcMar>
+            <w:vAlign w:val="center"/>
+          </w:tcPr>
+          <w:p>
+            <w:pPr>
+              <w:spacing w:line="252" w:lineRule="auto"/>
+            </w:pPr>
+            <w:r>
+              <w:rPr>
+                <w:sz w:val="16"/>
+              </w:rPr>
+              <w:t>Frontend muestra PDF, imágenes, Word, Excel, máximo 10MB.</w:t>
+            </w:r>
+          </w:p>
+        </w:tc>
+        <w:tc>
+          <w:tcPr>
+            <w:tcW w:w="1247" w:type="dxa"/>
+            <w:shd w:val="clear" w:color="auto" w:fill="EAF1DD" w:themeFill="accent3" w:themeFillTint="33"/>
+            <w:tcMar>
+              <w:top w:w="80" w:type="dxa"/>
+              <w:left w:w="120" w:type="dxa"/>
+              <w:bottom w:w="80" w:type="dxa"/>
+              <w:right w:w="120" w:type="dxa"/>
+            </w:tcMar>
+            <w:vAlign w:val="center"/>
+          </w:tcPr>
+          <w:p>
+            <w:pPr>
+              <w:spacing w:line="252" w:lineRule="auto"/>
+            </w:pPr>
+            <w:r>
+              <w:rPr>
+                <w:sz w:val="16"/>
+              </w:rPr>
+              <w:t>Completo</w:t>
+            </w:r>
+          </w:p>
+        </w:tc>
+        <w:tc>
+          <w:tcPr>
+            <w:tcW w:w="2268" w:type="dxa"/>
+            <w:tcMar>
+              <w:top w:w="80" w:type="dxa"/>
+              <w:left w:w="120" w:type="dxa"/>
+              <w:bottom w:w="80" w:type="dxa"/>
+              <w:right w:w="120" w:type="dxa"/>
+            </w:tcMar>
+            <w:vAlign w:val="center"/>
+          </w:tcPr>
+          <w:p>
+            <w:pPr>
+              <w:spacing w:line="252" w:lineRule="auto"/>
+            </w:pPr>
+            <w:r>
+              <w:rPr>
+                <w:sz w:val="16"/>
+              </w:rPr>
+              <w:t>Centralizar configuración y validar en backend.</w:t>
             </w:r>
           </w:p>
         </w:tc>
@@ -5480,7 +5666,7 @@
               <w:rPr>
                 <w:sz w:val="16"/>
               </w:rPr>
-              <w:t>14</w:t>
+              <w:t>15</w:t>
             </w:r>
           </w:p>
         </w:tc>
@@ -5503,7 +5689,7 @@
               <w:rPr>
                 <w:sz w:val="16"/>
               </w:rPr>
-              <w:t>Tipo de archivo y MB por criterio GTIC</w:t>
+              <w:t>Eliminar sólo Cumplimiento con motivo</w:t>
             </w:r>
           </w:p>
         </w:tc>
@@ -5526,32 +5712,45 @@
               <w:rPr>
                 <w:sz w:val="16"/>
               </w:rPr>
-              <w:t>Frontend muestra PDF, imágenes, Word, Excel, máximo 10MB.</w:t>
+              <w:t>Eliminaciones existen sin evidencia de motivo obligatorio ni rol Cumplimiento.</w:t>
             </w:r>
           </w:p>
         </w:tc>
         <w:tc>
           <w:tcPr>
             <w:tcW w:w="1247" w:type="dxa"/>
-            <w:shd w:val="clear" w:color="auto" w:fill="FFF2CC"/>
-            <w:tcMar>
-              <w:top w:w="80" w:type="dxa"/>
-              <w:left w:w="120" w:type="dxa"/>
-              <w:bottom w:w="80" w:type="dxa"/>
-              <w:right w:w="120" w:type="dxa"/>
-            </w:tcMar>
-            <w:vAlign w:val="center"/>
-          </w:tcPr>
-          <w:p>
-            <w:pPr>
-              <w:spacing w:line="252" w:lineRule="auto"/>
-            </w:pPr>
-            <w:r>
-              <w:rPr>
-                <w:sz w:val="16"/>
-              </w:rPr>
-              <w:t>Parcial</w:t>
-            </w:r>
+            <w:shd w:val="clear" w:color="auto" w:fill="EAF1DD" w:themeFill="accent3" w:themeFillTint="33"/>
+            <w:tcMar>
+              <w:top w:w="80" w:type="dxa"/>
+              <w:left w:w="120" w:type="dxa"/>
+              <w:bottom w:w="80" w:type="dxa"/>
+              <w:right w:w="120" w:type="dxa"/>
+            </w:tcMar>
+            <w:vAlign w:val="center"/>
+          </w:tcPr>
+          <w:p>
+            <w:pPr>
+              <w:spacing w:line="252" w:lineRule="auto"/>
+              <w:rPr>
+                <w:b/>
+              </w:rPr>
+            </w:pPr>
+            <w:r>
+              <w:rPr>
+                <w:b/>
+                <w:sz w:val="16"/>
+              </w:rPr>
+              <w:t>Completo</w:t>
+            </w:r>
+            <w:bookmarkStart w:id="0" w:name="_GoBack"/>
+            <w:r>
+              <w:rPr>
+                <w:b/>
+                <w:sz w:val="16"/>
+              </w:rPr>
+              <w:t xml:space="preserve"> con Mejoras</w:t>
+            </w:r>
+            <w:bookmarkEnd w:id="0"/>
           </w:p>
         </w:tc>
         <w:tc>
@@ -5568,133 +5767,39 @@
           <w:p>
             <w:pPr>
               <w:spacing w:line="252" w:lineRule="auto"/>
-            </w:pPr>
-            <w:r>
-              <w:rPr>
-                <w:sz w:val="16"/>
-              </w:rPr>
-              <w:t>Centralizar configuración y validar en backend.</w:t>
-            </w:r>
-          </w:p>
-        </w:tc>
-      </w:tr>
-      <w:tr>
-        <w:trPr>
-          <w:jc w:val="center"/>
-        </w:trPr>
-        <w:tc>
-          <w:tcPr>
-            <w:tcW w:w="567" w:type="dxa"/>
-            <w:tcMar>
-              <w:top w:w="80" w:type="dxa"/>
-              <w:left w:w="120" w:type="dxa"/>
-              <w:bottom w:w="80" w:type="dxa"/>
-              <w:right w:w="120" w:type="dxa"/>
-            </w:tcMar>
-            <w:vAlign w:val="center"/>
-          </w:tcPr>
-          <w:p>
-            <w:pPr>
-              <w:spacing w:line="252" w:lineRule="auto"/>
-            </w:pPr>
-            <w:r>
-              <w:rPr>
-                <w:sz w:val="16"/>
-              </w:rPr>
-              <w:t>15</w:t>
-            </w:r>
-          </w:p>
-        </w:tc>
-        <w:tc>
-          <w:tcPr>
-            <w:tcW w:w="2494" w:type="dxa"/>
-            <w:tcMar>
-              <w:top w:w="80" w:type="dxa"/>
-              <w:left w:w="120" w:type="dxa"/>
-              <w:bottom w:w="80" w:type="dxa"/>
-              <w:right w:w="120" w:type="dxa"/>
-            </w:tcMar>
-            <w:vAlign w:val="center"/>
-          </w:tcPr>
-          <w:p>
-            <w:pPr>
-              <w:spacing w:line="252" w:lineRule="auto"/>
-            </w:pPr>
-            <w:r>
-              <w:rPr>
-                <w:sz w:val="16"/>
-              </w:rPr>
-              <w:t>Eliminar sólo Cumplimiento con motivo</w:t>
-            </w:r>
-          </w:p>
-        </w:tc>
-        <w:tc>
-          <w:tcPr>
-            <w:tcW w:w="2324" w:type="dxa"/>
-            <w:tcMar>
-              <w:top w:w="80" w:type="dxa"/>
-              <w:left w:w="120" w:type="dxa"/>
-              <w:bottom w:w="80" w:type="dxa"/>
-              <w:right w:w="120" w:type="dxa"/>
-            </w:tcMar>
-            <w:vAlign w:val="center"/>
-          </w:tcPr>
-          <w:p>
-            <w:pPr>
-              <w:spacing w:line="252" w:lineRule="auto"/>
-            </w:pPr>
-            <w:r>
-              <w:rPr>
-                <w:sz w:val="16"/>
-              </w:rPr>
-              <w:t>Eliminaciones existen sin evidencia de motivo obligatorio ni rol Cumplimiento.</w:t>
-            </w:r>
-          </w:p>
-        </w:tc>
-        <w:tc>
-          <w:tcPr>
-            <w:tcW w:w="1247" w:type="dxa"/>
-            <w:shd w:val="clear" w:color="auto" w:fill="FCE4D6"/>
-            <w:tcMar>
-              <w:top w:w="80" w:type="dxa"/>
-              <w:left w:w="120" w:type="dxa"/>
-              <w:bottom w:w="80" w:type="dxa"/>
-              <w:right w:w="120" w:type="dxa"/>
-            </w:tcMar>
-            <w:vAlign w:val="center"/>
-          </w:tcPr>
-          <w:p>
-            <w:pPr>
-              <w:spacing w:line="252" w:lineRule="auto"/>
-            </w:pPr>
-            <w:r>
-              <w:rPr>
-                <w:sz w:val="16"/>
-              </w:rPr>
-              <w:t>No encontrado</w:t>
-            </w:r>
-          </w:p>
-        </w:tc>
-        <w:tc>
-          <w:tcPr>
-            <w:tcW w:w="2268" w:type="dxa"/>
-            <w:tcMar>
-              <w:top w:w="80" w:type="dxa"/>
-              <w:left w:w="120" w:type="dxa"/>
-              <w:bottom w:w="80" w:type="dxa"/>
-              <w:right w:w="120" w:type="dxa"/>
-            </w:tcMar>
-            <w:vAlign w:val="center"/>
-          </w:tcPr>
-          <w:p>
-            <w:pPr>
-              <w:spacing w:line="252" w:lineRule="auto"/>
+              <w:rPr>
+                <w:sz w:val="16"/>
+              </w:rPr>
             </w:pPr>
             <w:r>
               <w:rPr>
                 <w:sz w:val="16"/>
               </w:rPr>
               <w:t>Implementar control por permiso/rol, motivo obligatorio y auditoría.</w:t>
+            </w:r>
+          </w:p>
+          <w:p>
+            <w:pPr>
+              <w:spacing w:line="252" w:lineRule="auto"/>
+              <w:rPr>
+                <w:sz w:val="16"/>
+              </w:rPr>
+            </w:pPr>
+          </w:p>
+          <w:p>
+            <w:pPr>
+              <w:spacing w:line="252" w:lineRule="auto"/>
+              <w:rPr>
+                <w:sz w:val="16"/>
+                <w:szCs w:val="16"/>
+              </w:rPr>
+            </w:pPr>
+            <w:r>
+              <w:rPr>
+                <w:sz w:val="16"/>
+                <w:szCs w:val="16"/>
+              </w:rPr>
+              <w:t>Motivo obligatorio y auditoría implementados; pendiente validar rol/permiso Cumplimiento.</w:t>
             </w:r>
           </w:p>
         </w:tc>
@@ -5953,6 +6058,7 @@
           <w:color w:val="1F4D78"/>
           <w:sz w:val="32"/>
         </w:rPr>
+        <w:lastRenderedPageBreak/>
         <w:t>8. Qué está terminado</w:t>
       </w:r>
     </w:p>
@@ -6285,7 +6391,6 @@
           <w:color w:val="1F4D78"/>
           <w:sz w:val="32"/>
         </w:rPr>
-        <w:lastRenderedPageBreak/>
         <w:t>9. Qué hay que cerrar</w:t>
       </w:r>
     </w:p>
@@ -7113,6 +7218,7 @@
         <w:rPr>
           <w:sz w:val="20"/>
         </w:rPr>
+        <w:lastRenderedPageBreak/>
         <w:t>Validación backend de archivos por política GTIC.</w:t>
       </w:r>
     </w:p>
@@ -7432,7 +7538,6 @@
               <w:rPr>
                 <w:sz w:val="16"/>
               </w:rPr>
-              <w:lastRenderedPageBreak/>
               <w:t>Calificación coincidencias</w:t>
             </w:r>
           </w:p>
@@ -8778,6 +8883,7 @@
           <w:color w:val="1F4D78"/>
           <w:sz w:val="32"/>
         </w:rPr>
+        <w:lastRenderedPageBreak/>
         <w:t>13. Orden recomendado de desarrollo</w:t>
       </w:r>
     </w:p>
@@ -8925,7 +9031,6 @@
           <w:color w:val="1F4D78"/>
           <w:sz w:val="32"/>
         </w:rPr>
-        <w:lastRenderedPageBreak/>
         <w:t>14. Criterios de aceptación</w:t>
       </w:r>
     </w:p>
@@ -9854,6 +9959,7 @@
           <w:color w:val="1F4D78"/>
           <w:sz w:val="32"/>
         </w:rPr>
+        <w:lastRenderedPageBreak/>
         <w:t>16. Conclusión</w:t>
       </w:r>
     </w:p>
@@ -22279,6 +22385,37 @@
       <w:szCs w:val="20"/>
     </w:rPr>
   </w:style>
+  <w:style w:type="paragraph" w:styleId="Textodeglobo">
+    <w:name w:val="Balloon Text"/>
+    <w:basedOn w:val="Normal"/>
+    <w:link w:val="TextodegloboCar"/>
+    <w:uiPriority w:val="99"/>
+    <w:semiHidden/>
+    <w:unhideWhenUsed/>
+    <w:rsid w:val="009710FC"/>
+    <w:pPr>
+      <w:spacing w:after="0" w:line="240" w:lineRule="auto"/>
+    </w:pPr>
+    <w:rPr>
+      <w:rFonts w:ascii="Segoe UI" w:hAnsi="Segoe UI" w:cs="Segoe UI"/>
+      <w:sz w:val="18"/>
+      <w:szCs w:val="18"/>
+    </w:rPr>
+  </w:style>
+  <w:style w:type="character" w:customStyle="1" w:styleId="TextodegloboCar">
+    <w:name w:val="Texto de globo Car"/>
+    <w:basedOn w:val="Fuentedeprrafopredeter"/>
+    <w:link w:val="Textodeglobo"/>
+    <w:uiPriority w:val="99"/>
+    <w:semiHidden/>
+    <w:rsid w:val="009710FC"/>
+    <w:rPr>
+      <w:rFonts w:ascii="Segoe UI" w:hAnsi="Segoe UI" w:cs="Segoe UI"/>
+      <w:sz w:val="18"/>
+      <w:szCs w:val="18"/>
+      <w:lang w:val="es-419"/>
+    </w:rPr>
+  </w:style>
 </w:styles>
 </file>
 
@@ -22607,7 +22744,7 @@
 </file>
 
 <file path=customXml/itemProps1.xml><?xml version="1.0" encoding="utf-8"?>
-<ds:datastoreItem xmlns:ds="http://schemas.openxmlformats.org/officeDocument/2006/customXml" ds:itemID="{DDA5D964-8107-47EF-A04A-C7CC393A54A2}">
+<ds:datastoreItem xmlns:ds="http://schemas.openxmlformats.org/officeDocument/2006/customXml" ds:itemID="{ECEED4E2-FB16-4F37-9F6A-DA5EAC7A8EF5}">
   <ds:schemaRefs>
     <ds:schemaRef ds:uri="http://schemas.openxmlformats.org/officeDocument/2006/bibliography"/>
   </ds:schemaRefs>

</xml_diff>